<commit_message>
Reconcile 250-user collateral to new scores; delete the 50-user study
- Doc builders updated to the re-derived composite scores (USR-118 51.7 #1,
  USR-156 46.2 #2, USR-234 20.0 #7, USR-042 12.9 #30) and catch-all-four FP
  8.1% -> 10.6%; per-phase score tables overwritten to authoritative values.
- Refreshed data/tier3_results/composite_scores.csv (dynamic-table source) and
  regenerated the builders that read it live.
- Deleted the separate 50-user / 130-day / 19-week study (build_analysis_doc.py,
  build_analysis_deck.py, build_technical_deck.py + their outputs) and stripped
  the dangling 50-user AUC footnotes — all collateral is now 250-user only.
- Demo-video builders intentionally untouched.

Co-Authored-By: Claude Opus 4.8 <noreply@anthropic.com>
</commit_message>
<xml_diff>
--- a/WP DLA/Presentation/Behavioral_Digital_Twin_DeepDive_DataPoints_INTERNAL.docx
+++ b/WP DLA/Presentation/Behavioral_Digital_Twin_DeepDive_DataPoints_INTERNAL.docx
@@ -2839,7 +2839,7 @@
           <w:b w:val="0"/>
           <w:i/>
         </w:rPr>
-        <w:t>Read it honestly: the access_pattern zone ramps about 10x in the final two weeks, but Volt's COMPOSITE drift only creeps (0.013 to 0.033) and its CUSUM reaches just 0.020, below the 0.05 fire line. Volt does not separate by dramatic drift; CUSUM is the broad net, and Volt is ultimately caught by BREADTH in the composite score (Part 6, rank #24). That low drift is exactly why it is the stealthiest of the four.</w:t>
+        <w:t>Read it honestly: the access_pattern zone ramps about 10x in the final two weeks, but Volt's COMPOSITE drift only creeps (0.013 to 0.033) and its CUSUM reaches just 0.020, below the 0.05 fire line. Volt does not separate by dramatic drift; CUSUM is the broad net, and Volt is ultimately caught by BREADTH in the composite score (Part 6, rank #30). That low drift is exactly why it is the stealthiest of the four.</w:t>
       </w:r>
     </w:p>
     <w:p>
@@ -4702,7 +4702,7 @@
           <w:b w:val="0"/>
           <w:i/>
         </w:rPr>
-        <w:t>Slow APT: a novel IP every week for 60 weeks. max_persistence 60 &gt; 10 gives min(60/5,10)=10; weeks_frac 1.00 &gt; 0.5 adds 1.00 x 3 = 3; total 13.0. Volt is 0 (LOTL uses internal admin tooling, no external beacon); Salt 2.8 (one novel IP for 14 weeks); Insider 0 (a novel IP once, below the 10-week gate). For Slow APT, signal_strength is only 4.47 and breadth is 1, so this persistent novel IP is the ONLY signal that lifts it to rank #7; without it, Slow APT is missed entirely.</w:t>
+        <w:t>Slow APT: a novel IP every week for 60 weeks. max_persistence 60 &gt; 10 gives min(60/5,10)=10; weeks_frac 1.00 &gt; 0.5 adds 1.00 x 3 = 3; total 13.0. Volt is 0 (LOTL uses internal admin tooling, no external beacon); Salt 2.8 (one novel IP for 14 weeks); Insider 0 (a novel IP once, below the 10-week gate). For Slow APT, signal_strength is only 4.50 and breadth is 2, so this persistent novel IP is the ONLY signal that lifts it to rank #7; without it, Slow APT is missed entirely.</w:t>
       </w:r>
     </w:p>
     <w:p>
@@ -4921,7 +4921,7 @@
               <w:rPr>
                 <w:sz w:val="15"/>
               </w:rPr>
-              <w:t>USR-118 / QA Eng (Legal)</w:t>
+              <w:t>USR-118 / QA Eng (Engineering)</w:t>
             </w:r>
           </w:p>
         </w:tc>
@@ -4949,7 +4949,7 @@
               <w:rPr>
                 <w:sz w:val="15"/>
               </w:rPr>
-              <w:t>29.89</w:t>
+              <w:t>30.60</w:t>
             </w:r>
           </w:p>
         </w:tc>
@@ -4963,7 +4963,7 @@
               <w:rPr>
                 <w:sz w:val="15"/>
               </w:rPr>
-              <w:t>18 (16)</w:t>
+              <w:t>17 (16)</w:t>
             </w:r>
           </w:p>
         </w:tc>
@@ -4991,7 +4991,7 @@
               <w:rPr>
                 <w:sz w:val="15"/>
               </w:rPr>
-              <w:t>8.65</w:t>
+              <w:t>9.00</w:t>
             </w:r>
           </w:p>
         </w:tc>
@@ -5005,7 +5005,7 @@
               <w:rPr>
                 <w:sz w:val="15"/>
               </w:rPr>
-              <w:t>7.94</w:t>
+              <w:t>8.10</w:t>
             </w:r>
           </w:p>
         </w:tc>
@@ -5033,7 +5033,7 @@
               <w:rPr>
                 <w:sz w:val="15"/>
               </w:rPr>
-              <w:t>51.27</w:t>
+              <w:t>51.71</w:t>
             </w:r>
           </w:p>
         </w:tc>
@@ -5205,7 +5205,7 @@
               <w:rPr>
                 <w:sz w:val="15"/>
               </w:rPr>
-              <w:t>USR-234 / ML Eng</w:t>
+              <w:t>USR-234 / ML Eng (Data Science)</w:t>
             </w:r>
           </w:p>
         </w:tc>
@@ -5233,7 +5233,7 @@
               <w:rPr>
                 <w:sz w:val="15"/>
               </w:rPr>
-              <w:t>4.47</w:t>
+              <w:t>4.50</w:t>
             </w:r>
           </w:p>
         </w:tc>
@@ -5247,7 +5247,7 @@
               <w:rPr>
                 <w:sz w:val="15"/>
               </w:rPr>
-              <w:t>1 (0)</w:t>
+              <w:t>2 (0)</w:t>
             </w:r>
           </w:p>
         </w:tc>
@@ -5317,7 +5317,7 @@
               <w:rPr>
                 <w:sz w:val="15"/>
               </w:rPr>
-              <w:t>19.44</w:t>
+              <w:t>20.00</w:t>
             </w:r>
           </w:p>
         </w:tc>
@@ -5347,7 +5347,7 @@
               <w:rPr>
                 <w:sz w:val="15"/>
               </w:rPr>
-              <w:t>USR-042 / SOC Op</w:t>
+              <w:t>USR-042 / SOC Op (Security)</w:t>
             </w:r>
           </w:p>
         </w:tc>
@@ -5361,7 +5361,7 @@
               <w:rPr>
                 <w:sz w:val="15"/>
               </w:rPr>
-              <w:t>#24</w:t>
+              <w:t>#30</w:t>
             </w:r>
           </w:p>
         </w:tc>
@@ -5375,7 +5375,7 @@
               <w:rPr>
                 <w:sz w:val="15"/>
               </w:rPr>
-              <w:t>6.40</w:t>
+              <w:t>6.20</w:t>
             </w:r>
           </w:p>
         </w:tc>
@@ -5389,7 +5389,7 @@
               <w:rPr>
                 <w:sz w:val="15"/>
               </w:rPr>
-              <w:t>11 (3)</w:t>
+              <w:t>10 (3)</w:t>
             </w:r>
           </w:p>
         </w:tc>
@@ -5403,7 +5403,7 @@
               <w:rPr>
                 <w:sz w:val="15"/>
               </w:rPr>
-              <w:t>3.80</w:t>
+              <w:t>3.70</w:t>
             </w:r>
           </w:p>
         </w:tc>
@@ -5417,7 +5417,7 @@
               <w:rPr>
                 <w:sz w:val="15"/>
               </w:rPr>
-              <w:t>0.47</w:t>
+              <w:t>0.40</w:t>
             </w:r>
           </w:p>
         </w:tc>
@@ -5431,7 +5431,7 @@
               <w:rPr>
                 <w:sz w:val="15"/>
               </w:rPr>
-              <w:t>1.43</w:t>
+              <w:t>1.40</w:t>
             </w:r>
           </w:p>
         </w:tc>
@@ -5459,7 +5459,7 @@
               <w:rPr>
                 <w:sz w:val="15"/>
               </w:rPr>
-              <w:t>13.70</w:t>
+              <w:t>12.90</w:t>
             </w:r>
           </w:p>
         </w:tc>
@@ -5474,7 +5474,7 @@
         <w:rPr>
           <w:color w:val="2E75B6"/>
         </w:rPr>
-        <w:t>Salt Typhoon - USR-118 - Rank #1 (51.27)</w:t>
+        <w:t>Salt Typhoon - USR-118 - Rank #1 (51.71)</w:t>
       </w:r>
     </w:p>
     <w:p>
@@ -5488,7 +5488,7 @@
         <w:t xml:space="preserve">Caught by: </w:t>
       </w:r>
       <w:r>
-        <w:t>breadth and context. QA Engineer whose department is Legal (cross-domain). 18 features elevated, the highest context spread of anyone (8.65).</w:t>
+        <w:t>breadth and context. QA Engineer whose department is Engineering. 17 features elevated, the highest context spread of anyone (9.00).</w:t>
       </w:r>
     </w:p>
     <w:p>
@@ -5501,9 +5501,9 @@
           <w:color w:val="333333"/>
           <w:sz w:val="19"/>
         </w:rPr>
-        <w:t>51.27 = 29.89 + 18x0.5 + 9.58x0.3 + 8.65x0.5 + 7.94x0.3 + 2.8</w:t>
+        <w:t>51.71 = 30.60 + 17x0.5 + 9.58x0.3 + 9.00x0.5 + 8.10x0.3 + 2.8</w:t>
         <w:br/>
-        <w:t xml:space="preserve">      = 29.89 + 9.00 + 2.87 + 4.32 + 2.38 + 2.80</w:t>
+        <w:t xml:space="preserve">      = 30.60 + 8.50 + 2.87 + 4.50 + 2.43 + 2.80</w:t>
       </w:r>
     </w:p>
     <w:p>
@@ -5552,7 +5552,7 @@
         <w:rPr>
           <w:color w:val="2E75B6"/>
         </w:rPr>
-        <w:t>Slow APT - USR-234 - Rank #7 (19.44) - the 'invisible to thresholds' case</w:t>
+        <w:t>Slow APT - USR-234 - Rank #7 (20.00) - the 'invisible to thresholds' case</w:t>
       </w:r>
     </w:p>
     <w:p>
@@ -5566,7 +5566,7 @@
         <w:t xml:space="preserve">Caught by: </w:t>
       </w:r>
       <w:r>
-        <w:t>novelty ALONE. signal_strength 4.47, breadth(z&gt;1.5) = 1, breadth(z&gt;2.0) = 0. On every magnitude or threshold method this user is invisible. The novelty score of 13.0 (a novel C2 IP every week for 60 weeks) is what lifts it to rank 7. This is the proof that the system catches what thresholds structurally cannot.</w:t>
+        <w:t>novelty ALONE. signal_strength 4.50, breadth(z&gt;1.5) = 2, breadth(z&gt;2.0) = 0. On every magnitude or threshold method this user is invisible. The novelty score of 13.0 (a novel C2 IP every week for 60 weeks) is what lifts it to rank 7. This is the proof that the system catches what thresholds structurally cannot.</w:t>
       </w:r>
     </w:p>
     <w:p>
@@ -5579,7 +5579,7 @@
           <w:color w:val="333333"/>
           <w:sz w:val="19"/>
         </w:rPr>
-        <w:t>19.44 = 4.47 + 0.50 + 0.47 + 0.74 + 0.25 + 13.00</w:t>
+        <w:t>20.00 = 4.50 + 1.00 + 0.47 + 0.74 + 0.25 + 13.00</w:t>
       </w:r>
     </w:p>
     <w:p>
@@ -5590,7 +5590,7 @@
         <w:rPr>
           <w:color w:val="2E75B6"/>
         </w:rPr>
-        <w:t>Volt Typhoon - USR-042 - Rank #24 (13.70) - the hardest, living-off-the-land</w:t>
+        <w:t>Volt Typhoon - USR-042 - Rank #30 (12.90) - the hardest, living-off-the-land</w:t>
       </w:r>
     </w:p>
     <w:p>
@@ -5604,7 +5604,7 @@
         <w:t xml:space="preserve">Caught by: </w:t>
       </w:r>
       <w:r>
-        <w:t>breadth of small elevations. signal_strength 6.40, breadth(z&gt;1.5)=11 but breadth(z&gt;2.0)=only 3, novelty 0. Translation: many small elevations, no single dramatic one. That is the signature of legitimate admin tooling used maliciously.</w:t>
+        <w:t>breadth of small elevations. signal_strength 6.20, breadth(z&gt;1.5)=10 but breadth(z&gt;2.0)=only 3, novelty 0. Translation: many small elevations, no single dramatic one. That is the signature of legitimate admin tooling used maliciously.</w:t>
       </w:r>
     </w:p>
     <w:p>
@@ -5617,7 +5617,7 @@
           <w:color w:val="333333"/>
           <w:sz w:val="19"/>
         </w:rPr>
-        <w:t>13.70 = 6.40 + 5.50 + 1.14 + 0.23 + 0.43 + 0.00</w:t>
+        <w:t>12.90 = 6.20 + 5.00 + 1.11 + 0.20 + 0.42 + 0.00</w:t>
       </w:r>
     </w:p>
     <w:p>
@@ -6245,7 +6245,7 @@
         <w:rPr>
           <w:color w:val="1F3864"/>
         </w:rPr>
-        <w:t>Part 9. The live 8.1% derivation</w:t>
+        <w:t>Part 9. The live 10.6% derivation</w:t>
       </w:r>
     </w:p>
     <w:p>
@@ -6253,7 +6253,7 @@
         <w:pStyle w:val="ListBullet"/>
       </w:pPr>
       <w:r>
-        <w:t>Sort all 250 entities by composite. Volt (13.70) is the stealthiest scorer, so the operating line must reach down to 13.70 to catch all four. 20 of 246 normal users score above that line, so 20/246 = 8.1% false positive, 4/4 caught.</w:t>
+        <w:t>Sort all 250 entities by composite. Volt (12.90) is the stealthiest scorer, so the operating line must reach down to 12.95 to catch all four. 26 of 246 normal users score above that line, so 26/246 = 10.6% false positive, 4/4 caught.</w:t>
       </w:r>
     </w:p>
     <w:p>
@@ -6281,7 +6281,7 @@
         <w:t xml:space="preserve">Separation is by RANK, not a clean gap: </w:t>
       </w:r>
       <w:r>
-        <w:t>the top normal user (USR-081, HR Manager, 21.52) outscores Slow APT (19.44) and Volt (13.70). About 20 normals outscore Volt. This is why we deliver a ranked list, not a threshold; the honest claim is recall at the top of the ranking.</w:t>
+        <w:t>the top normal user (USR-081, HR Manager, 21.52) outscores Slow APT (20.00) and Volt (12.90). About 26 normals outscore Volt. This is why we deliver a ranked list, not a threshold; the honest claim is recall at the top of the ranking.</w:t>
       </w:r>
     </w:p>
     <w:tbl>
@@ -6412,7 +6412,7 @@
               <w:rPr>
                 <w:sz w:val="17"/>
               </w:rPr>
-              <w:t>51.27</w:t>
+              <w:t>51.71</w:t>
             </w:r>
           </w:p>
         </w:tc>
@@ -6760,7 +6760,7 @@
               <w:rPr>
                 <w:sz w:val="17"/>
               </w:rPr>
-              <w:t>19.44</w:t>
+              <w:t>20.00</w:t>
             </w:r>
           </w:p>
         </w:tc>
@@ -6804,7 +6804,7 @@
               <w:rPr>
                 <w:sz w:val="17"/>
               </w:rPr>
-              <w:t>~17 more normals</w:t>
+              <w:t>~23 more normals</w:t>
             </w:r>
           </w:p>
         </w:tc>
@@ -6818,7 +6818,7 @@
               <w:rPr>
                 <w:sz w:val="17"/>
               </w:rPr>
-              <w:t>13.70 to 19.4</w:t>
+              <w:t>12.90 to 20.0</w:t>
             </w:r>
           </w:p>
         </w:tc>
@@ -6834,7 +6834,7 @@
               <w:rPr>
                 <w:sz w:val="17"/>
               </w:rPr>
-              <w:t>24</w:t>
+              <w:t>30</w:t>
             </w:r>
           </w:p>
         </w:tc>
@@ -6876,7 +6876,7 @@
               <w:rPr>
                 <w:sz w:val="17"/>
               </w:rPr>
-              <w:t>13.70</w:t>
+              <w:t>12.90</w:t>
             </w:r>
           </w:p>
         </w:tc>

</xml_diff>